<commit_message>
feat: initialize application data models, Supabase types, document templates, and edit modal component
</commit_message>
<xml_diff>
--- a/public/templates/Informe_de_necessitats_OFI.docx
+++ b/public/templates/Informe_de_necessitats_OFI.docx
@@ -1168,27 +1168,20 @@
           <w:szCs w:val="20"/>
           <w:lang w:val="ca-ES" w:eastAsia="es-ES"/>
         </w:rPr>
-        <w:t>4. Especificacions tècniques de la prestació</w:t>
-      </w:r>
-    </w:p>
-    <w:p>
-      <w:pPr>
-        <w:spacing w:before="100" w:beforeAutospacing="1" w:after="100" w:afterAutospacing="1" w:line="240" w:lineRule="auto"/>
-        <w:rPr>
-          <w:rFonts w:ascii="Open Sans Light" w:eastAsia="Times New Roman" w:hAnsi="Open Sans Light" w:cs="Open Sans Light"/>
-          <w:sz w:val="20"/>
-          <w:szCs w:val="20"/>
-          <w:lang w:val="ca-ES" w:eastAsia="es-ES"/>
-        </w:rPr>
-      </w:pPr>
-      <w:r>
-        <w:rPr>
-          <w:rFonts w:ascii="Open Sans Light" w:eastAsia="Times New Roman" w:hAnsi="Open Sans Light" w:cs="Open Sans Light"/>
-          <w:sz w:val="20"/>
-          <w:szCs w:val="20"/>
-          <w:lang w:val="ca-ES" w:eastAsia="es-ES"/>
-        </w:rPr>
-        <w:t>Les prestacions a realitzar consisteixen en:</w:t>
+        <w:t>4. Especificacions tècni</w:t>
+      </w:r>
+      <w:bookmarkStart w:id="0" w:name="_GoBack"/>
+      <w:bookmarkEnd w:id="0"/>
+      <w:r>
+        <w:rPr>
+          <w:rFonts w:ascii="Open Sans Light" w:eastAsia="Times New Roman" w:hAnsi="Open Sans Light" w:cs="Open Sans Light"/>
+          <w:b/>
+          <w:bCs/>
+          <w:sz w:val="20"/>
+          <w:szCs w:val="20"/>
+          <w:lang w:val="ca-ES" w:eastAsia="es-ES"/>
+        </w:rPr>
+        <w:t>ques de la prestació</w:t>
       </w:r>
     </w:p>
     <w:p>
@@ -1998,10 +1991,9 @@
       <w:pPr>
         <w:spacing w:before="100" w:beforeAutospacing="1" w:after="100" w:afterAutospacing="1" w:line="240" w:lineRule="auto"/>
         <w:rPr>
-          <w:rFonts w:ascii="Open Sans Light" w:eastAsia="Times New Roman" w:hAnsi="Open Sans Light" w:cs="Open Sans Light"/>
-          <w:sz w:val="20"/>
-          <w:szCs w:val="20"/>
-          <w:lang w:val="ca-ES" w:eastAsia="es-ES"/>
+          <w:rFonts w:ascii="Open Sans Light" w:eastAsia="Open Sans Light" w:hAnsi="Open Sans Light" w:cs="Open Sans Light"/>
+          <w:sz w:val="20"/>
+          <w:szCs w:val="20"/>
         </w:rPr>
       </w:pPr>
       <w:r>
@@ -2076,6 +2068,233 @@
       </w:pPr>
       <w:r>
         <w:rPr>
+          <w:rFonts w:ascii="Open Sans Light" w:eastAsia="Open Sans Light" w:hAnsi="Open Sans Light" w:cs="Open Sans Light"/>
+          <w:sz w:val="20"/>
+          <w:szCs w:val="20"/>
+        </w:rPr>
+        <w:fldChar w:fldCharType="begin"/>
+      </w:r>
+      <w:r>
+        <w:rPr>
+          <w:rFonts w:ascii="Open Sans Light" w:eastAsia="Open Sans Light" w:hAnsi="Open Sans Light" w:cs="Open Sans Light"/>
+          <w:sz w:val="20"/>
+          <w:szCs w:val="20"/>
+        </w:rPr>
+        <w:instrText xml:space="preserve"> MERGEFIELD "Característiques_tècniques_especificaci" </w:instrText>
+      </w:r>
+      <w:r>
+        <w:rPr>
+          <w:rFonts w:ascii="Open Sans Light" w:eastAsia="Open Sans Light" w:hAnsi="Open Sans Light" w:cs="Open Sans Light"/>
+          <w:sz w:val="20"/>
+          <w:szCs w:val="20"/>
+        </w:rPr>
+        <w:fldChar w:fldCharType="separate"/>
+      </w:r>
+      <w:r>
+        <w:rPr>
+          <w:rFonts w:ascii="Open Sans Light" w:eastAsia="Open Sans Light" w:hAnsi="Open Sans Light" w:cs="Open Sans Light"/>
+          <w:noProof/>
+          <w:sz w:val="20"/>
+          <w:szCs w:val="20"/>
+        </w:rPr>
+        <w:t>{{record.</w:t>
+      </w:r>
+      <w:r>
+        <w:rPr>
+          <w:rFonts w:ascii="Open Sans Light" w:eastAsia="Open Sans Light" w:hAnsi="Open Sans Light" w:cs="Open Sans Light"/>
+          <w:noProof/>
+          <w:sz w:val="20"/>
+          <w:szCs w:val="20"/>
+        </w:rPr>
+        <w:t>explicacio</w:t>
+      </w:r>
+      <w:r>
+        <w:rPr>
+          <w:rFonts w:ascii="Open Sans Light" w:eastAsia="Open Sans Light" w:hAnsi="Open Sans Light" w:cs="Open Sans Light"/>
+          <w:noProof/>
+          <w:sz w:val="20"/>
+          <w:szCs w:val="20"/>
+        </w:rPr>
+        <w:t>_no_contractacio</w:t>
+      </w:r>
+      <w:r>
+        <w:rPr>
+          <w:rFonts w:ascii="Open Sans Light" w:eastAsia="Open Sans Light" w:hAnsi="Open Sans Light" w:cs="Open Sans Light"/>
+          <w:noProof/>
+          <w:sz w:val="20"/>
+          <w:szCs w:val="20"/>
+        </w:rPr>
+        <w:t>}}</w:t>
+      </w:r>
+      <w:r>
+        <w:rPr>
+          <w:rFonts w:ascii="Open Sans Light" w:eastAsia="Open Sans Light" w:hAnsi="Open Sans Light" w:cs="Open Sans Light"/>
+          <w:sz w:val="20"/>
+          <w:szCs w:val="20"/>
+        </w:rPr>
+        <w:fldChar w:fldCharType="end"/>
+      </w:r>
+    </w:p>
+    <w:p>
+      <w:pPr>
+        <w:spacing w:before="100" w:beforeAutospacing="1" w:after="100" w:afterAutospacing="1" w:line="240" w:lineRule="auto"/>
+        <w:rPr>
+          <w:rFonts w:ascii="Open Sans Light" w:eastAsia="Times New Roman" w:hAnsi="Open Sans Light" w:cs="Open Sans Light"/>
+          <w:sz w:val="20"/>
+          <w:szCs w:val="20"/>
+          <w:lang w:val="ca-ES" w:eastAsia="es-ES"/>
+        </w:rPr>
+      </w:pPr>
+      <w:r>
+        <w:rPr>
+          <w:rFonts w:ascii="Open Sans Light" w:eastAsia="Times New Roman" w:hAnsi="Open Sans Light" w:cs="Open Sans Light"/>
+          <w:sz w:val="20"/>
+          <w:szCs w:val="20"/>
+          <w:lang w:val="ca-ES" w:eastAsia="es-ES"/>
+        </w:rPr>
+        <w:t>En</w:t>
+      </w:r>
+      <w:r>
+        <w:rPr>
+          <w:rFonts w:ascii="Open Sans Light" w:eastAsia="Times New Roman" w:hAnsi="Open Sans Light" w:cs="Open Sans Light"/>
+          <w:sz w:val="20"/>
+          <w:szCs w:val="20"/>
+          <w:lang w:val="ca-ES" w:eastAsia="es-ES"/>
+        </w:rPr>
+        <w:t xml:space="preserve"> qualsevol cas</w:t>
+      </w:r>
+      <w:r>
+        <w:rPr>
+          <w:rFonts w:ascii="Open Sans Light" w:eastAsia="Times New Roman" w:hAnsi="Open Sans Light" w:cs="Open Sans Light"/>
+          <w:sz w:val="20"/>
+          <w:szCs w:val="20"/>
+          <w:lang w:val="ca-ES" w:eastAsia="es-ES"/>
+        </w:rPr>
+        <w:t xml:space="preserve">, la prestació </w:t>
+      </w:r>
+      <w:r>
+        <w:rPr>
+          <w:rFonts w:ascii="Open Sans Light" w:eastAsia="Times New Roman" w:hAnsi="Open Sans Light" w:cs="Open Sans Light"/>
+          <w:sz w:val="20"/>
+          <w:szCs w:val="20"/>
+          <w:lang w:val="ca-ES" w:eastAsia="es-ES"/>
+        </w:rPr>
+        <w:t>és</w:t>
+      </w:r>
+      <w:r>
+        <w:rPr>
+          <w:rFonts w:ascii="Open Sans Light" w:eastAsia="Times New Roman" w:hAnsi="Open Sans Light" w:cs="Open Sans Light"/>
+          <w:sz w:val="20"/>
+          <w:szCs w:val="20"/>
+          <w:lang w:val="ca-ES" w:eastAsia="es-ES"/>
+        </w:rPr>
+        <w:t xml:space="preserve"> imprescindible pel correcte funcionament del servei, i la seva interrupció </w:t>
+      </w:r>
+      <w:r>
+        <w:rPr>
+          <w:rFonts w:ascii="Open Sans Light" w:eastAsia="Times New Roman" w:hAnsi="Open Sans Light" w:cs="Open Sans Light"/>
+          <w:sz w:val="20"/>
+          <w:szCs w:val="20"/>
+          <w:lang w:val="ca-ES" w:eastAsia="es-ES"/>
+        </w:rPr>
+        <w:t>provocaria</w:t>
+      </w:r>
+      <w:r>
+        <w:rPr>
+          <w:rFonts w:ascii="Open Sans Light" w:eastAsia="Times New Roman" w:hAnsi="Open Sans Light" w:cs="Open Sans Light"/>
+          <w:sz w:val="20"/>
+          <w:szCs w:val="20"/>
+          <w:lang w:val="ca-ES" w:eastAsia="es-ES"/>
+        </w:rPr>
+        <w:t xml:space="preserve"> un perjudici greu, motiu pel qual el </w:t>
+      </w:r>
+      <w:r>
+        <w:rPr>
+          <w:rFonts w:ascii="Open Sans Light" w:eastAsia="Times New Roman" w:hAnsi="Open Sans Light" w:cs="Open Sans Light"/>
+          <w:sz w:val="20"/>
+          <w:szCs w:val="20"/>
+          <w:lang w:val="ca-ES" w:eastAsia="es-ES"/>
+        </w:rPr>
+        <w:t>centre/servei</w:t>
+      </w:r>
+      <w:r>
+        <w:rPr>
+          <w:rFonts w:ascii="Open Sans Light" w:eastAsia="Times New Roman" w:hAnsi="Open Sans Light" w:cs="Open Sans Light"/>
+          <w:sz w:val="20"/>
+          <w:szCs w:val="20"/>
+          <w:lang w:val="ca-ES" w:eastAsia="es-ES"/>
+        </w:rPr>
+        <w:t xml:space="preserve"> </w:t>
+      </w:r>
+      <w:r>
+        <w:rPr>
+          <w:rFonts w:ascii="Open Sans Light" w:eastAsia="Times New Roman" w:hAnsi="Open Sans Light" w:cs="Open Sans Light"/>
+          <w:sz w:val="20"/>
+          <w:szCs w:val="20"/>
+          <w:lang w:val="ca-ES" w:eastAsia="es-ES"/>
+        </w:rPr>
+        <w:fldChar w:fldCharType="begin"/>
+      </w:r>
+      <w:r>
+        <w:rPr>
+          <w:rFonts w:ascii="Open Sans Light" w:eastAsia="Times New Roman" w:hAnsi="Open Sans Light" w:cs="Open Sans Light"/>
+          <w:sz w:val="20"/>
+          <w:szCs w:val="20"/>
+          <w:lang w:val="ca-ES" w:eastAsia="es-ES"/>
+        </w:rPr>
+        <w:instrText xml:space="preserve"> MERGEFIELD Òrgan_de_contractació </w:instrText>
+      </w:r>
+      <w:r>
+        <w:rPr>
+          <w:rFonts w:ascii="Open Sans Light" w:eastAsia="Times New Roman" w:hAnsi="Open Sans Light" w:cs="Open Sans Light"/>
+          <w:sz w:val="20"/>
+          <w:szCs w:val="20"/>
+          <w:lang w:val="ca-ES" w:eastAsia="es-ES"/>
+        </w:rPr>
+        <w:fldChar w:fldCharType="separate"/>
+      </w:r>
+      <w:r>
+        <w:rPr>
+          <w:rFonts w:ascii="Open Sans Light" w:eastAsia="Times New Roman" w:hAnsi="Open Sans Light" w:cs="Open Sans Light"/>
+          <w:sz w:val="20"/>
+          <w:szCs w:val="20"/>
+          <w:lang w:val="ca-ES" w:eastAsia="es-ES"/>
+        </w:rPr>
+        <w:t>{{record.centre_servei}}</w:t>
+      </w:r>
+      <w:r>
+        <w:rPr>
+          <w:rFonts w:ascii="Open Sans Light" w:eastAsia="Times New Roman" w:hAnsi="Open Sans Light" w:cs="Open Sans Light"/>
+          <w:sz w:val="20"/>
+          <w:szCs w:val="20"/>
+          <w:lang w:val="ca-ES" w:eastAsia="es-ES"/>
+        </w:rPr>
+        <w:fldChar w:fldCharType="end"/>
+      </w:r>
+      <w:r>
+        <w:rPr>
+          <w:rFonts w:ascii="Open Sans Light" w:eastAsia="Times New Roman" w:hAnsi="Open Sans Light" w:cs="Open Sans Light"/>
+          <w:sz w:val="20"/>
+          <w:szCs w:val="20"/>
+          <w:lang w:val="ca-ES" w:eastAsia="es-ES"/>
+        </w:rPr>
+        <w:t xml:space="preserve"> permet</w:t>
+      </w:r>
+      <w:r>
+        <w:rPr>
+          <w:rFonts w:ascii="Open Sans Light" w:eastAsia="Times New Roman" w:hAnsi="Open Sans Light" w:cs="Open Sans Light"/>
+          <w:sz w:val="20"/>
+          <w:szCs w:val="20"/>
+          <w:lang w:val="ca-ES" w:eastAsia="es-ES"/>
+        </w:rPr>
+        <w:t xml:space="preserve"> la continuïtat de la prestació fins a la regularització administrativa. </w:t>
+      </w:r>
+    </w:p>
+    <w:p>
+      <w:pPr>
+        <w:spacing w:before="100" w:beforeAutospacing="1" w:after="100" w:afterAutospacing="1" w:line="240" w:lineRule="auto"/>
+        <w:outlineLvl w:val="1"/>
+        <w:rPr>
           <w:rFonts w:ascii="Open Sans Light" w:eastAsia="Times New Roman" w:hAnsi="Open Sans Light" w:cs="Open Sans Light"/>
           <w:b/>
           <w:bCs/>
@@ -2083,158 +2302,169 @@
           <w:szCs w:val="20"/>
           <w:lang w:val="ca-ES" w:eastAsia="es-ES"/>
         </w:rPr>
-        <w:t>Explicació global:</w:t>
-      </w:r>
-      <w:r>
-        <w:rPr>
-          <w:rFonts w:ascii="Open Sans Light" w:eastAsia="Times New Roman" w:hAnsi="Open Sans Light" w:cs="Open Sans Light"/>
-          <w:sz w:val="20"/>
-          <w:szCs w:val="20"/>
-          <w:lang w:val="ca-ES" w:eastAsia="es-ES"/>
-        </w:rPr>
-        <w:br/>
-        <w:t>En</w:t>
-      </w:r>
-      <w:r>
-        <w:rPr>
-          <w:rFonts w:ascii="Open Sans Light" w:eastAsia="Times New Roman" w:hAnsi="Open Sans Light" w:cs="Open Sans Light"/>
-          <w:sz w:val="20"/>
-          <w:szCs w:val="20"/>
-          <w:lang w:val="ca-ES" w:eastAsia="es-ES"/>
-        </w:rPr>
-        <w:t xml:space="preserve"> qualsevol cas</w:t>
-      </w:r>
-      <w:r>
-        <w:rPr>
-          <w:rFonts w:ascii="Open Sans Light" w:eastAsia="Times New Roman" w:hAnsi="Open Sans Light" w:cs="Open Sans Light"/>
-          <w:sz w:val="20"/>
-          <w:szCs w:val="20"/>
-          <w:lang w:val="ca-ES" w:eastAsia="es-ES"/>
-        </w:rPr>
-        <w:t xml:space="preserve">, la prestació </w:t>
-      </w:r>
-      <w:r>
-        <w:rPr>
-          <w:rFonts w:ascii="Open Sans Light" w:eastAsia="Times New Roman" w:hAnsi="Open Sans Light" w:cs="Open Sans Light"/>
-          <w:sz w:val="20"/>
-          <w:szCs w:val="20"/>
-          <w:lang w:val="ca-ES" w:eastAsia="es-ES"/>
-        </w:rPr>
-        <w:t>és</w:t>
-      </w:r>
-      <w:r>
-        <w:rPr>
-          <w:rFonts w:ascii="Open Sans Light" w:eastAsia="Times New Roman" w:hAnsi="Open Sans Light" w:cs="Open Sans Light"/>
-          <w:sz w:val="20"/>
-          <w:szCs w:val="20"/>
-          <w:lang w:val="ca-ES" w:eastAsia="es-ES"/>
-        </w:rPr>
-        <w:t xml:space="preserve"> imprescindible pel correcte funcionament del servei, i la seva interrupció </w:t>
-      </w:r>
-      <w:r>
-        <w:rPr>
-          <w:rFonts w:ascii="Open Sans Light" w:eastAsia="Times New Roman" w:hAnsi="Open Sans Light" w:cs="Open Sans Light"/>
-          <w:sz w:val="20"/>
-          <w:szCs w:val="20"/>
-          <w:lang w:val="ca-ES" w:eastAsia="es-ES"/>
-        </w:rPr>
-        <w:t>provocaria</w:t>
-      </w:r>
-      <w:r>
-        <w:rPr>
-          <w:rFonts w:ascii="Open Sans Light" w:eastAsia="Times New Roman" w:hAnsi="Open Sans Light" w:cs="Open Sans Light"/>
-          <w:sz w:val="20"/>
-          <w:szCs w:val="20"/>
-          <w:lang w:val="ca-ES" w:eastAsia="es-ES"/>
-        </w:rPr>
-        <w:t xml:space="preserve"> un perjudici greu, motiu pel qual el </w:t>
-      </w:r>
-      <w:r>
-        <w:rPr>
-          <w:rFonts w:ascii="Open Sans Light" w:eastAsia="Times New Roman" w:hAnsi="Open Sans Light" w:cs="Open Sans Light"/>
-          <w:sz w:val="20"/>
-          <w:szCs w:val="20"/>
-          <w:lang w:val="ca-ES" w:eastAsia="es-ES"/>
-        </w:rPr>
-        <w:t>centre/servei</w:t>
-      </w:r>
-      <w:r>
-        <w:rPr>
-          <w:rFonts w:ascii="Open Sans Light" w:eastAsia="Times New Roman" w:hAnsi="Open Sans Light" w:cs="Open Sans Light"/>
-          <w:sz w:val="20"/>
-          <w:szCs w:val="20"/>
-          <w:lang w:val="ca-ES" w:eastAsia="es-ES"/>
-        </w:rPr>
-        <w:t xml:space="preserve"> </w:t>
-      </w:r>
-      <w:r>
-        <w:rPr>
-          <w:rFonts w:ascii="Open Sans Light" w:eastAsia="Times New Roman" w:hAnsi="Open Sans Light" w:cs="Open Sans Light"/>
-          <w:sz w:val="20"/>
-          <w:szCs w:val="20"/>
-          <w:lang w:val="ca-ES" w:eastAsia="es-ES"/>
-        </w:rPr>
-        <w:fldChar w:fldCharType="begin"/>
-      </w:r>
-      <w:r>
-        <w:rPr>
-          <w:rFonts w:ascii="Open Sans Light" w:eastAsia="Times New Roman" w:hAnsi="Open Sans Light" w:cs="Open Sans Light"/>
-          <w:sz w:val="20"/>
-          <w:szCs w:val="20"/>
-          <w:lang w:val="ca-ES" w:eastAsia="es-ES"/>
-        </w:rPr>
-        <w:instrText xml:space="preserve"> MERGEFIELD Òrgan_de_contractació </w:instrText>
-      </w:r>
-      <w:r>
-        <w:rPr>
-          <w:rFonts w:ascii="Open Sans Light" w:eastAsia="Times New Roman" w:hAnsi="Open Sans Light" w:cs="Open Sans Light"/>
-          <w:sz w:val="20"/>
-          <w:szCs w:val="20"/>
-          <w:lang w:val="ca-ES" w:eastAsia="es-ES"/>
-        </w:rPr>
-        <w:fldChar w:fldCharType="separate"/>
-      </w:r>
-      <w:r>
-        <w:rPr>
-          <w:rFonts w:ascii="Open Sans Light" w:eastAsia="Times New Roman" w:hAnsi="Open Sans Light" w:cs="Open Sans Light"/>
-          <w:sz w:val="20"/>
-          <w:szCs w:val="20"/>
-          <w:lang w:val="ca-ES" w:eastAsia="es-ES"/>
-        </w:rPr>
-        <w:t>{{record.centre_servei}}</w:t>
-      </w:r>
-      <w:r>
-        <w:rPr>
-          <w:rFonts w:ascii="Open Sans Light" w:eastAsia="Times New Roman" w:hAnsi="Open Sans Light" w:cs="Open Sans Light"/>
-          <w:sz w:val="20"/>
-          <w:szCs w:val="20"/>
-          <w:lang w:val="ca-ES" w:eastAsia="es-ES"/>
-        </w:rPr>
-        <w:fldChar w:fldCharType="end"/>
-      </w:r>
-      <w:r>
-        <w:rPr>
-          <w:rFonts w:ascii="Open Sans Light" w:eastAsia="Times New Roman" w:hAnsi="Open Sans Light" w:cs="Open Sans Light"/>
-          <w:sz w:val="20"/>
-          <w:szCs w:val="20"/>
-          <w:lang w:val="ca-ES" w:eastAsia="es-ES"/>
-        </w:rPr>
-        <w:t xml:space="preserve"> permet</w:t>
-      </w:r>
-      <w:r>
-        <w:rPr>
-          <w:rFonts w:ascii="Open Sans Light" w:eastAsia="Times New Roman" w:hAnsi="Open Sans Light" w:cs="Open Sans Light"/>
-          <w:sz w:val="20"/>
-          <w:szCs w:val="20"/>
-          <w:lang w:val="ca-ES" w:eastAsia="es-ES"/>
-        </w:rPr>
-        <w:t xml:space="preserve"> la continuïtat de la prestació fins a la regularització administrativa. </w:t>
+      </w:pPr>
+      <w:r>
+        <w:rPr>
+          <w:rFonts w:ascii="Open Sans Light" w:eastAsia="Times New Roman" w:hAnsi="Open Sans Light" w:cs="Open Sans Light"/>
+          <w:b/>
+          <w:bCs/>
+          <w:sz w:val="20"/>
+          <w:szCs w:val="20"/>
+          <w:lang w:val="ca-ES" w:eastAsia="es-ES"/>
+        </w:rPr>
+        <w:lastRenderedPageBreak/>
+        <w:t>8. Des de quan s’està fent aquest</w:t>
+      </w:r>
+      <w:r>
+        <w:rPr>
+          <w:rFonts w:ascii="Open Sans Light" w:eastAsia="Times New Roman" w:hAnsi="Open Sans Light" w:cs="Open Sans Light"/>
+          <w:b/>
+          <w:bCs/>
+          <w:sz w:val="20"/>
+          <w:szCs w:val="20"/>
+          <w:lang w:val="ca-ES" w:eastAsia="es-ES"/>
+        </w:rPr>
+        <w:t>a despesa</w:t>
+      </w:r>
+      <w:r>
+        <w:rPr>
+          <w:rFonts w:ascii="Open Sans Light" w:eastAsia="Times New Roman" w:hAnsi="Open Sans Light" w:cs="Open Sans Light"/>
+          <w:b/>
+          <w:bCs/>
+          <w:sz w:val="20"/>
+          <w:szCs w:val="20"/>
+          <w:lang w:val="ca-ES" w:eastAsia="es-ES"/>
+        </w:rPr>
+        <w:t xml:space="preserve"> amb omissió</w:t>
       </w:r>
     </w:p>
     <w:p>
       <w:pPr>
         <w:spacing w:before="100" w:beforeAutospacing="1" w:after="100" w:afterAutospacing="1" w:line="240" w:lineRule="auto"/>
-        <w:outlineLvl w:val="1"/>
+        <w:rPr>
+          <w:rFonts w:ascii="Open Sans Light" w:eastAsia="Times New Roman" w:hAnsi="Open Sans Light" w:cs="Open Sans Light"/>
+          <w:sz w:val="20"/>
+          <w:szCs w:val="20"/>
+          <w:lang w:val="ca-ES" w:eastAsia="es-ES"/>
+        </w:rPr>
+      </w:pPr>
+      <w:r>
+        <w:rPr>
+          <w:rFonts w:ascii="Open Sans Light" w:eastAsia="Times New Roman" w:hAnsi="Open Sans Light" w:cs="Open Sans Light"/>
+          <w:sz w:val="20"/>
+          <w:szCs w:val="20"/>
+          <w:lang w:val="ca-ES" w:eastAsia="es-ES"/>
+        </w:rPr>
+        <w:t xml:space="preserve">La despesa s’ha realitzat amb omissió de fiscalització prèvia </w:t>
+      </w:r>
+      <w:r>
+        <w:rPr>
+          <w:rFonts w:ascii="Open Sans Light" w:eastAsia="Times New Roman" w:hAnsi="Open Sans Light" w:cs="Open Sans Light"/>
+          <w:sz w:val="20"/>
+          <w:szCs w:val="20"/>
+          <w:lang w:val="ca-ES" w:eastAsia="es-ES"/>
+        </w:rPr>
+        <w:t>des del</w:t>
+      </w:r>
+      <w:r>
+        <w:rPr>
+          <w:rFonts w:ascii="Open Sans Light" w:eastAsia="Times New Roman" w:hAnsi="Open Sans Light" w:cs="Open Sans Light"/>
+          <w:sz w:val="20"/>
+          <w:szCs w:val="20"/>
+          <w:lang w:val="ca-ES" w:eastAsia="es-ES"/>
+        </w:rPr>
+        <w:t xml:space="preserve"> dia</w:t>
+      </w:r>
+      <w:r>
+        <w:rPr>
+          <w:rFonts w:ascii="Open Sans Light" w:eastAsia="Times New Roman" w:hAnsi="Open Sans Light" w:cs="Open Sans Light"/>
+          <w:sz w:val="20"/>
+          <w:szCs w:val="20"/>
+          <w:lang w:val="ca-ES" w:eastAsia="es-ES"/>
+        </w:rPr>
+        <w:t xml:space="preserve"> </w:t>
+      </w:r>
+      <w:r>
+        <w:rPr>
+          <w:rFonts w:ascii="Open Sans Light" w:eastAsia="Open Sans Light" w:hAnsi="Open Sans Light" w:cs="Open Sans Light"/>
+          <w:sz w:val="20"/>
+          <w:szCs w:val="20"/>
+        </w:rPr>
+        <w:fldChar w:fldCharType="begin"/>
+      </w:r>
+      <w:r>
+        <w:rPr>
+          <w:rFonts w:ascii="Open Sans Light" w:eastAsia="Open Sans Light" w:hAnsi="Open Sans Light" w:cs="Open Sans Light"/>
+          <w:sz w:val="20"/>
+          <w:szCs w:val="20"/>
+        </w:rPr>
+        <w:instrText xml:space="preserve"> MERGEFIELD "Característiques_tècniques_especificaci" </w:instrText>
+      </w:r>
+      <w:r>
+        <w:rPr>
+          <w:rFonts w:ascii="Open Sans Light" w:eastAsia="Open Sans Light" w:hAnsi="Open Sans Light" w:cs="Open Sans Light"/>
+          <w:sz w:val="20"/>
+          <w:szCs w:val="20"/>
+        </w:rPr>
+        <w:fldChar w:fldCharType="separate"/>
+      </w:r>
+      <w:r>
+        <w:rPr>
+          <w:rFonts w:ascii="Open Sans Light" w:eastAsia="Open Sans Light" w:hAnsi="Open Sans Light" w:cs="Open Sans Light"/>
+          <w:noProof/>
+          <w:sz w:val="20"/>
+          <w:szCs w:val="20"/>
+        </w:rPr>
+        <w:t>{{record.</w:t>
+      </w:r>
+      <w:r>
+        <w:rPr>
+          <w:rFonts w:ascii="Open Sans Light" w:eastAsia="Open Sans Light" w:hAnsi="Open Sans Light" w:cs="Open Sans Light"/>
+          <w:noProof/>
+          <w:sz w:val="20"/>
+          <w:szCs w:val="20"/>
+        </w:rPr>
+        <w:t>data_ofi_inicial</w:t>
+      </w:r>
+      <w:r>
+        <w:rPr>
+          <w:rFonts w:ascii="Open Sans Light" w:eastAsia="Open Sans Light" w:hAnsi="Open Sans Light" w:cs="Open Sans Light"/>
+          <w:noProof/>
+          <w:sz w:val="20"/>
+          <w:szCs w:val="20"/>
+        </w:rPr>
+        <w:t>}}</w:t>
+      </w:r>
+      <w:r>
+        <w:rPr>
+          <w:rFonts w:ascii="Open Sans Light" w:eastAsia="Open Sans Light" w:hAnsi="Open Sans Light" w:cs="Open Sans Light"/>
+          <w:sz w:val="20"/>
+          <w:szCs w:val="20"/>
+        </w:rPr>
+        <w:fldChar w:fldCharType="end"/>
+      </w:r>
+      <w:r>
+        <w:rPr>
+          <w:rFonts w:ascii="Open Sans Light" w:eastAsia="Times New Roman" w:hAnsi="Open Sans Light" w:cs="Open Sans Light"/>
+          <w:sz w:val="20"/>
+          <w:szCs w:val="20"/>
+          <w:lang w:val="ca-ES" w:eastAsia="es-ES"/>
+        </w:rPr>
+        <w:t xml:space="preserve">, coincidint amb la finalització </w:t>
+      </w:r>
+      <w:r>
+        <w:rPr>
+          <w:rFonts w:ascii="Open Sans Light" w:eastAsia="Times New Roman" w:hAnsi="Open Sans Light" w:cs="Open Sans Light"/>
+          <w:sz w:val="20"/>
+          <w:szCs w:val="20"/>
+          <w:lang w:val="ca-ES" w:eastAsia="es-ES"/>
+        </w:rPr>
+        <w:t>del contracte/concert o amb l’inici de la prestació no tramitada.</w:t>
+      </w:r>
+    </w:p>
+    <w:p>
+      <w:pPr>
+        <w:spacing w:before="100" w:beforeAutospacing="1" w:after="100" w:afterAutospacing="1" w:line="240" w:lineRule="auto"/>
         <w:rPr>
           <w:rFonts w:ascii="Open Sans Light" w:eastAsia="Times New Roman" w:hAnsi="Open Sans Light" w:cs="Open Sans Light"/>
           <w:b/>
@@ -2253,178 +2483,107 @@
           <w:szCs w:val="20"/>
           <w:lang w:val="ca-ES" w:eastAsia="es-ES"/>
         </w:rPr>
-        <w:lastRenderedPageBreak/>
-        <w:t>8. Des de quan s’està fent aquest</w:t>
-      </w:r>
-      <w:r>
-        <w:rPr>
-          <w:rFonts w:ascii="Open Sans Light" w:eastAsia="Times New Roman" w:hAnsi="Open Sans Light" w:cs="Open Sans Light"/>
-          <w:b/>
-          <w:bCs/>
-          <w:sz w:val="20"/>
-          <w:szCs w:val="20"/>
-          <w:lang w:val="ca-ES" w:eastAsia="es-ES"/>
-        </w:rPr>
-        <w:t>a despesa</w:t>
-      </w:r>
-      <w:r>
-        <w:rPr>
-          <w:rFonts w:ascii="Open Sans Light" w:eastAsia="Times New Roman" w:hAnsi="Open Sans Light" w:cs="Open Sans Light"/>
-          <w:b/>
-          <w:bCs/>
-          <w:sz w:val="20"/>
-          <w:szCs w:val="20"/>
-          <w:lang w:val="ca-ES" w:eastAsia="es-ES"/>
-        </w:rPr>
-        <w:t xml:space="preserve"> amb omissió</w:t>
+        <w:t>9. Justificació dels imports de les prestacions que es pretenen liquidar</w:t>
       </w:r>
     </w:p>
     <w:p>
       <w:pPr>
         <w:spacing w:before="100" w:beforeAutospacing="1" w:after="100" w:afterAutospacing="1" w:line="240" w:lineRule="auto"/>
-        <w:rPr>
-          <w:rFonts w:ascii="Open Sans Light" w:eastAsia="Times New Roman" w:hAnsi="Open Sans Light" w:cs="Open Sans Light"/>
-          <w:sz w:val="20"/>
-          <w:szCs w:val="20"/>
-          <w:lang w:val="ca-ES" w:eastAsia="es-ES"/>
-        </w:rPr>
-      </w:pPr>
-      <w:r>
-        <w:rPr>
-          <w:rFonts w:ascii="Open Sans Light" w:eastAsia="Times New Roman" w:hAnsi="Open Sans Light" w:cs="Open Sans Light"/>
-          <w:sz w:val="20"/>
-          <w:szCs w:val="20"/>
-          <w:lang w:val="ca-ES" w:eastAsia="es-ES"/>
-        </w:rPr>
-        <w:t xml:space="preserve">La despesa s’ha realitzat amb omissió de fiscalització prèvia </w:t>
-      </w:r>
-      <w:r>
-        <w:rPr>
-          <w:rFonts w:ascii="Open Sans Light" w:eastAsia="Times New Roman" w:hAnsi="Open Sans Light" w:cs="Open Sans Light"/>
-          <w:sz w:val="20"/>
-          <w:szCs w:val="20"/>
-          <w:lang w:val="ca-ES" w:eastAsia="es-ES"/>
-        </w:rPr>
-        <w:t>des del</w:t>
-      </w:r>
-      <w:r>
-        <w:rPr>
-          <w:rFonts w:ascii="Open Sans Light" w:eastAsia="Times New Roman" w:hAnsi="Open Sans Light" w:cs="Open Sans Light"/>
-          <w:sz w:val="20"/>
-          <w:szCs w:val="20"/>
-          <w:lang w:val="ca-ES" w:eastAsia="es-ES"/>
-        </w:rPr>
-        <w:t xml:space="preserve"> dia</w:t>
-      </w:r>
-      <w:r>
-        <w:rPr>
-          <w:rFonts w:ascii="Open Sans Light" w:eastAsia="Times New Roman" w:hAnsi="Open Sans Light" w:cs="Open Sans Light"/>
-          <w:sz w:val="20"/>
-          <w:szCs w:val="20"/>
-          <w:lang w:val="ca-ES" w:eastAsia="es-ES"/>
-        </w:rPr>
-        <w:t xml:space="preserve"> </w:t>
-      </w:r>
-      <w:r>
-        <w:rPr>
-          <w:rFonts w:ascii="Open Sans Light" w:eastAsia="Open Sans Light" w:hAnsi="Open Sans Light" w:cs="Open Sans Light"/>
-          <w:sz w:val="20"/>
-          <w:szCs w:val="20"/>
-        </w:rPr>
-        <w:fldChar w:fldCharType="begin"/>
-      </w:r>
-      <w:r>
-        <w:rPr>
-          <w:rFonts w:ascii="Open Sans Light" w:eastAsia="Open Sans Light" w:hAnsi="Open Sans Light" w:cs="Open Sans Light"/>
-          <w:sz w:val="20"/>
-          <w:szCs w:val="20"/>
-        </w:rPr>
-        <w:instrText xml:space="preserve"> MERGEFIELD "Característiques_tècniques_especificaci" </w:instrText>
-      </w:r>
-      <w:r>
-        <w:rPr>
-          <w:rFonts w:ascii="Open Sans Light" w:eastAsia="Open Sans Light" w:hAnsi="Open Sans Light" w:cs="Open Sans Light"/>
-          <w:sz w:val="20"/>
-          <w:szCs w:val="20"/>
-        </w:rPr>
-        <w:fldChar w:fldCharType="separate"/>
-      </w:r>
-      <w:r>
-        <w:rPr>
-          <w:rFonts w:ascii="Open Sans Light" w:eastAsia="Open Sans Light" w:hAnsi="Open Sans Light" w:cs="Open Sans Light"/>
-          <w:noProof/>
-          <w:sz w:val="20"/>
-          <w:szCs w:val="20"/>
-        </w:rPr>
-        <w:t>{{record.</w:t>
-      </w:r>
-      <w:r>
-        <w:rPr>
-          <w:rFonts w:ascii="Open Sans Light" w:eastAsia="Open Sans Light" w:hAnsi="Open Sans Light" w:cs="Open Sans Light"/>
-          <w:noProof/>
-          <w:sz w:val="20"/>
-          <w:szCs w:val="20"/>
-        </w:rPr>
-        <w:t>data_ofi_inicial</w:t>
-      </w:r>
-      <w:r>
-        <w:rPr>
-          <w:rFonts w:ascii="Open Sans Light" w:eastAsia="Open Sans Light" w:hAnsi="Open Sans Light" w:cs="Open Sans Light"/>
-          <w:noProof/>
-          <w:sz w:val="20"/>
-          <w:szCs w:val="20"/>
-        </w:rPr>
-        <w:t>}}</w:t>
-      </w:r>
-      <w:r>
-        <w:rPr>
-          <w:rFonts w:ascii="Open Sans Light" w:eastAsia="Open Sans Light" w:hAnsi="Open Sans Light" w:cs="Open Sans Light"/>
-          <w:sz w:val="20"/>
-          <w:szCs w:val="20"/>
-        </w:rPr>
-        <w:fldChar w:fldCharType="end"/>
-      </w:r>
-      <w:r>
-        <w:rPr>
-          <w:rFonts w:ascii="Open Sans Light" w:eastAsia="Times New Roman" w:hAnsi="Open Sans Light" w:cs="Open Sans Light"/>
-          <w:sz w:val="20"/>
-          <w:szCs w:val="20"/>
-          <w:lang w:val="ca-ES" w:eastAsia="es-ES"/>
-        </w:rPr>
-        <w:t xml:space="preserve">, coincidint amb la finalització </w:t>
-      </w:r>
-      <w:r>
-        <w:rPr>
-          <w:rFonts w:ascii="Open Sans Light" w:eastAsia="Times New Roman" w:hAnsi="Open Sans Light" w:cs="Open Sans Light"/>
-          <w:sz w:val="20"/>
-          <w:szCs w:val="20"/>
-          <w:lang w:val="ca-ES" w:eastAsia="es-ES"/>
-        </w:rPr>
-        <w:t>del contracte/concert o amb l’inici de la prestació no tramitada.</w:t>
+        <w:jc w:val="both"/>
+        <w:rPr>
+          <w:rFonts w:ascii="Open Sans Light" w:eastAsia="Times New Roman" w:hAnsi="Open Sans Light" w:cs="Open Sans Light"/>
+          <w:sz w:val="20"/>
+          <w:szCs w:val="20"/>
+          <w:lang w:val="ca-ES" w:eastAsia="es-ES"/>
+        </w:rPr>
+      </w:pPr>
+      <w:r>
+        <w:rPr>
+          <w:rFonts w:ascii="Open Sans Light" w:eastAsia="Times New Roman" w:hAnsi="Open Sans Light" w:cs="Open Sans Light"/>
+          <w:sz w:val="20"/>
+          <w:szCs w:val="20"/>
+          <w:lang w:val="ca-ES" w:eastAsia="es-ES"/>
+        </w:rPr>
+        <w:t>Els imports de les prestacions objecte d’aquest informe s’ajusten als preus de mercat, tal com exigeix la normativa d’aplicació. A aquests efectes, el tècnic responsable ha realitzat les comprovacions oportunes i acredita que els imports responen a valors econòmicament ajustats i proporcionats, d’</w:t>
+      </w:r>
+      <w:r>
+        <w:rPr>
+          <w:rFonts w:ascii="Open Sans Light" w:eastAsia="Times New Roman" w:hAnsi="Open Sans Light" w:cs="Open Sans Light"/>
+          <w:sz w:val="20"/>
+          <w:szCs w:val="20"/>
+          <w:lang w:val="ca-ES" w:eastAsia="es-ES"/>
+        </w:rPr>
+        <w:t>acord amb els criteris següents:</w:t>
       </w:r>
     </w:p>
     <w:p>
       <w:pPr>
         <w:spacing w:before="100" w:beforeAutospacing="1" w:after="100" w:afterAutospacing="1" w:line="240" w:lineRule="auto"/>
-        <w:rPr>
-          <w:rFonts w:ascii="Open Sans Light" w:eastAsia="Times New Roman" w:hAnsi="Open Sans Light" w:cs="Open Sans Light"/>
-          <w:b/>
-          <w:bCs/>
-          <w:sz w:val="20"/>
-          <w:szCs w:val="20"/>
-          <w:lang w:val="ca-ES" w:eastAsia="es-ES"/>
-        </w:rPr>
-      </w:pPr>
-      <w:r>
-        <w:rPr>
-          <w:rFonts w:ascii="Open Sans Light" w:eastAsia="Times New Roman" w:hAnsi="Open Sans Light" w:cs="Open Sans Light"/>
-          <w:b/>
-          <w:bCs/>
-          <w:sz w:val="20"/>
-          <w:szCs w:val="20"/>
-          <w:lang w:val="ca-ES" w:eastAsia="es-ES"/>
-        </w:rPr>
-        <w:t>9. Justificació dels imports de les prestacions que es pretenen liquidar</w:t>
+        <w:jc w:val="both"/>
+        <w:rPr>
+          <w:rFonts w:ascii="Open Sans Light" w:eastAsia="Open Sans Light" w:hAnsi="Open Sans Light" w:cs="Open Sans Light"/>
+          <w:sz w:val="20"/>
+          <w:szCs w:val="20"/>
+        </w:rPr>
+      </w:pPr>
+      <w:r>
+        <w:rPr>
+          <w:rFonts w:ascii="Open Sans Light" w:eastAsia="Open Sans Light" w:hAnsi="Open Sans Light" w:cs="Open Sans Light"/>
+          <w:sz w:val="20"/>
+          <w:szCs w:val="20"/>
+        </w:rPr>
+        <w:fldChar w:fldCharType="begin"/>
+      </w:r>
+      <w:r>
+        <w:rPr>
+          <w:rFonts w:ascii="Open Sans Light" w:eastAsia="Open Sans Light" w:hAnsi="Open Sans Light" w:cs="Open Sans Light"/>
+          <w:sz w:val="20"/>
+          <w:szCs w:val="20"/>
+        </w:rPr>
+        <w:instrText xml:space="preserve"> MERGEFIELD "Característiques_tècniques_especificaci" </w:instrText>
+      </w:r>
+      <w:r>
+        <w:rPr>
+          <w:rFonts w:ascii="Open Sans Light" w:eastAsia="Open Sans Light" w:hAnsi="Open Sans Light" w:cs="Open Sans Light"/>
+          <w:sz w:val="20"/>
+          <w:szCs w:val="20"/>
+        </w:rPr>
+        <w:fldChar w:fldCharType="separate"/>
+      </w:r>
+      <w:r>
+        <w:rPr>
+          <w:rFonts w:ascii="Open Sans Light" w:eastAsia="Open Sans Light" w:hAnsi="Open Sans Light" w:cs="Open Sans Light"/>
+          <w:noProof/>
+          <w:sz w:val="20"/>
+          <w:szCs w:val="20"/>
+        </w:rPr>
+        <w:t>{{record.</w:t>
+      </w:r>
+      <w:r>
+        <w:rPr>
+          <w:rFonts w:ascii="Open Sans Light" w:eastAsia="Open Sans Light" w:hAnsi="Open Sans Light" w:cs="Open Sans Light"/>
+          <w:noProof/>
+          <w:sz w:val="20"/>
+          <w:szCs w:val="20"/>
+        </w:rPr>
+        <w:t>justificacio_preu</w:t>
+      </w:r>
+      <w:r>
+        <w:rPr>
+          <w:rFonts w:ascii="Open Sans Light" w:eastAsia="Open Sans Light" w:hAnsi="Open Sans Light" w:cs="Open Sans Light"/>
+          <w:noProof/>
+          <w:sz w:val="20"/>
+          <w:szCs w:val="20"/>
+        </w:rPr>
+        <w:t>}}</w:t>
+      </w:r>
+      <w:r>
+        <w:rPr>
+          <w:rFonts w:ascii="Open Sans Light" w:eastAsia="Open Sans Light" w:hAnsi="Open Sans Light" w:cs="Open Sans Light"/>
+          <w:sz w:val="20"/>
+          <w:szCs w:val="20"/>
+        </w:rPr>
+        <w:fldChar w:fldCharType="end"/>
       </w:r>
     </w:p>
     <w:p>
@@ -2440,36 +2599,6 @@
       </w:pPr>
       <w:r>
         <w:rPr>
-          <w:rFonts w:ascii="Open Sans Light" w:eastAsia="Times New Roman" w:hAnsi="Open Sans Light" w:cs="Open Sans Light"/>
-          <w:sz w:val="20"/>
-          <w:szCs w:val="20"/>
-          <w:lang w:val="ca-ES" w:eastAsia="es-ES"/>
-        </w:rPr>
-        <w:t>Els imports de les prestacions objecte d’aquest informe s’ajusten als preus de mercat, tal com exigeix la normativa d’aplicació. A aquests efectes, el tècnic responsable ha realitzat les comprovacions oportunes i acredita que els imports responen a valors econòmicament ajustats i proporcionats, d’</w:t>
-      </w:r>
-      <w:r>
-        <w:rPr>
-          <w:rFonts w:ascii="Open Sans Light" w:eastAsia="Times New Roman" w:hAnsi="Open Sans Light" w:cs="Open Sans Light"/>
-          <w:sz w:val="20"/>
-          <w:szCs w:val="20"/>
-          <w:lang w:val="ca-ES" w:eastAsia="es-ES"/>
-        </w:rPr>
-        <w:t>acord amb els criteris següents:</w:t>
-      </w:r>
-    </w:p>
-    <w:p>
-      <w:pPr>
-        <w:spacing w:before="100" w:beforeAutospacing="1" w:after="100" w:afterAutospacing="1" w:line="240" w:lineRule="auto"/>
-        <w:jc w:val="both"/>
-        <w:rPr>
-          <w:rFonts w:ascii="Open Sans Light" w:eastAsia="Times New Roman" w:hAnsi="Open Sans Light" w:cs="Open Sans Light"/>
-          <w:sz w:val="20"/>
-          <w:szCs w:val="20"/>
-          <w:lang w:val="ca-ES" w:eastAsia="es-ES"/>
-        </w:rPr>
-      </w:pPr>
-      <w:r>
-        <w:rPr>
           <w:rFonts w:ascii="Open Sans Light" w:eastAsia="Open Sans Light" w:hAnsi="Open Sans Light" w:cs="Open Sans Light"/>
           <w:sz w:val="20"/>
           <w:szCs w:val="20"/>
@@ -2508,10 +2637,17 @@
           <w:sz w:val="20"/>
           <w:szCs w:val="20"/>
         </w:rPr>
-        <w:t>justificacio_preu</w:t>
-      </w:r>
-      <w:bookmarkStart w:id="0" w:name="_GoBack"/>
-      <w:bookmarkEnd w:id="0"/>
+        <w:t>explicacio</w:t>
+      </w:r>
+      <w:r>
+        <w:rPr>
+          <w:rFonts w:ascii="Open Sans Light" w:eastAsia="Open Sans Light" w:hAnsi="Open Sans Light" w:cs="Open Sans Light"/>
+          <w:noProof/>
+          <w:sz w:val="20"/>
+          <w:szCs w:val="20"/>
+        </w:rPr>
+        <w:t>_preu</w:t>
+      </w:r>
       <w:r>
         <w:rPr>
           <w:rFonts w:ascii="Open Sans Light" w:eastAsia="Open Sans Light" w:hAnsi="Open Sans Light" w:cs="Open Sans Light"/>
@@ -3562,6 +3698,7 @@
   <w:style w:type="character" w:default="1" w:styleId="Fuentedeprrafopredeter">
     <w:name w:val="Default Paragraph Font"/>
     <w:uiPriority w:val="1"/>
+    <w:semiHidden/>
     <w:unhideWhenUsed/>
   </w:style>
   <w:style w:type="table" w:default="1" w:styleId="Tablanormal">
@@ -3916,15 +4053,6 @@
 </file>
 
 <file path=customXml/item2.xml><?xml version="1.0" encoding="utf-8"?>
-<?mso-contentType ?>
-<FormTemplates xmlns="http://schemas.microsoft.com/sharepoint/v3/contenttype/forms">
-  <Display>DocumentLibraryForm</Display>
-  <Edit>DocumentLibraryForm</Edit>
-  <New>DocumentLibraryForm</New>
-</FormTemplates>
-</file>
-
-<file path=customXml/item3.xml><?xml version="1.0" encoding="utf-8"?>
 <ct:contentTypeSchema xmlns:ct="http://schemas.microsoft.com/office/2006/metadata/contentType" xmlns:ma="http://schemas.microsoft.com/office/2006/metadata/properties/metaAttributes" ct:_="" ma:_="" ma:contentTypeName="Documento" ma:contentTypeID="0x010100BEA9B1C7EBF6D3438CD7ED5E9E199432" ma:contentTypeVersion="14" ma:contentTypeDescription="Crear nuevo documento." ma:contentTypeScope="" ma:versionID="2e283e6bc3a5fbbefccc32c5f809dde4">
   <xsd:schema xmlns:xsd="http://www.w3.org/2001/XMLSchema" xmlns:xs="http://www.w3.org/2001/XMLSchema" xmlns:p="http://schemas.microsoft.com/office/2006/metadata/properties" xmlns:ns2="74cf42d7-5302-4f1c-a14a-4e00bba5b2a8" xmlns:ns3="108d9c73-5d46-4471-9bd8-029f5de3680f" targetNamespace="http://schemas.microsoft.com/office/2006/metadata/properties" ma:root="true" ma:fieldsID="670afdc93dcbe6e64409644886b33f83" ns2:_="" ns3:_="">
     <xsd:import namespace="74cf42d7-5302-4f1c-a14a-4e00bba5b2a8"/>
@@ -4153,6 +4281,15 @@
 </ct:contentTypeSchema>
 </file>
 
+<file path=customXml/item3.xml><?xml version="1.0" encoding="utf-8"?>
+<?mso-contentType ?>
+<FormTemplates xmlns="http://schemas.microsoft.com/sharepoint/v3/contenttype/forms">
+  <Display>DocumentLibraryForm</Display>
+  <Edit>DocumentLibraryForm</Edit>
+  <New>DocumentLibraryForm</New>
+</FormTemplates>
+</file>
+
 <file path=customXml/item4.xml><?xml version="1.0" encoding="utf-8"?>
 <b:Sources xmlns:b="http://schemas.openxmlformats.org/officeDocument/2006/bibliography" xmlns="http://schemas.openxmlformats.org/officeDocument/2006/bibliography" SelectedStyle="\APASixthEditionOfficeOnline.xsl" StyleName="APA" Version="6"/>
 </file>
@@ -4169,14 +4306,6 @@
 </file>
 
 <file path=customXml/itemProps2.xml><?xml version="1.0" encoding="utf-8"?>
-<ds:datastoreItem xmlns:ds="http://schemas.openxmlformats.org/officeDocument/2006/customXml" ds:itemID="{150801C8-2C01-424E-BC6C-56C9B08C462E}">
-  <ds:schemaRefs>
-    <ds:schemaRef ds:uri="http://schemas.microsoft.com/sharepoint/v3/contenttype/forms"/>
-  </ds:schemaRefs>
-</ds:datastoreItem>
-</file>
-
-<file path=customXml/itemProps3.xml><?xml version="1.0" encoding="utf-8"?>
 <ds:datastoreItem xmlns:ds="http://schemas.openxmlformats.org/officeDocument/2006/customXml" ds:itemID="{02882DF2-B128-4C90-8FFD-571E4B92AFFE}">
   <ds:schemaRefs>
     <ds:schemaRef ds:uri="http://schemas.microsoft.com/office/2006/metadata/contentType"/>
@@ -4195,8 +4324,16 @@
 </ds:datastoreItem>
 </file>
 
+<file path=customXml/itemProps3.xml><?xml version="1.0" encoding="utf-8"?>
+<ds:datastoreItem xmlns:ds="http://schemas.openxmlformats.org/officeDocument/2006/customXml" ds:itemID="{150801C8-2C01-424E-BC6C-56C9B08C462E}">
+  <ds:schemaRefs>
+    <ds:schemaRef ds:uri="http://schemas.microsoft.com/sharepoint/v3/contenttype/forms"/>
+  </ds:schemaRefs>
+</ds:datastoreItem>
+</file>
+
 <file path=customXml/itemProps4.xml><?xml version="1.0" encoding="utf-8"?>
-<ds:datastoreItem xmlns:ds="http://schemas.openxmlformats.org/officeDocument/2006/customXml" ds:itemID="{5A1DDA70-5BAD-4CEE-ABE6-658F6B2C75BF}">
+<ds:datastoreItem xmlns:ds="http://schemas.openxmlformats.org/officeDocument/2006/customXml" ds:itemID="{7F102218-426B-4983-8477-E5076A01DD42}">
   <ds:schemaRefs>
     <ds:schemaRef ds:uri="http://schemas.openxmlformats.org/officeDocument/2006/bibliography"/>
   </ds:schemaRefs>

</xml_diff>

<commit_message>
OFI need report adapted
</commit_message>
<xml_diff>
--- a/public/templates/Informe_de_necessitats_OFI.docx
+++ b/public/templates/Informe_de_necessitats_OFI.docx
@@ -285,18 +285,8 @@
           <w:sz w:val="20"/>
           <w:szCs w:val="20"/>
         </w:rPr>
-        <w:t xml:space="preserve"> </w:t>
-      </w:r>
-      <w:proofErr w:type="spellStart"/>
-      <w:r>
-        <w:rPr>
-          <w:rFonts w:ascii="Open Sans Light" w:eastAsia="Open Sans Light" w:hAnsi="Open Sans Light" w:cs="Open Sans Light"/>
-          <w:sz w:val="20"/>
-          <w:szCs w:val="20"/>
-        </w:rPr>
-        <w:t>dies</w:t>
-      </w:r>
-      <w:proofErr w:type="spellEnd"/>
+        <w:t xml:space="preserve"> dies</w:t>
+      </w:r>
     </w:p>
     <w:p>
       <w:pPr>
@@ -1168,20 +1158,7 @@
           <w:szCs w:val="20"/>
           <w:lang w:val="ca-ES" w:eastAsia="es-ES"/>
         </w:rPr>
-        <w:t>4. Especificacions tècni</w:t>
-      </w:r>
-      <w:bookmarkStart w:id="0" w:name="_GoBack"/>
-      <w:bookmarkEnd w:id="0"/>
-      <w:r>
-        <w:rPr>
-          <w:rFonts w:ascii="Open Sans Light" w:eastAsia="Times New Roman" w:hAnsi="Open Sans Light" w:cs="Open Sans Light"/>
-          <w:b/>
-          <w:bCs/>
-          <w:sz w:val="20"/>
-          <w:szCs w:val="20"/>
-          <w:lang w:val="ca-ES" w:eastAsia="es-ES"/>
-        </w:rPr>
-        <w:t>ques de la prestació</w:t>
+        <w:t>4. Especificacions tècniques de la prestació</w:t>
       </w:r>
     </w:p>
     <w:p>
@@ -1696,7 +1673,6 @@
           <w:rFonts w:ascii="Open Sans Light" w:eastAsia="Open Sans Light" w:hAnsi="Open Sans Light" w:cs="Open Sans Light"/>
           <w:sz w:val="20"/>
           <w:szCs w:val="20"/>
-          <w:lang w:val="ca-ES"/>
         </w:rPr>
       </w:pPr>
       <w:r>
@@ -1877,10 +1853,163 @@
           <w:szCs w:val="20"/>
         </w:rPr>
         <w:t>)</w:t>
+      </w:r>
+      <w:r>
+        <w:rPr>
+          <w:rFonts w:ascii="Open Sans Light" w:eastAsia="Open Sans Light" w:hAnsi="Open Sans Light" w:cs="Open Sans Light"/>
+          <w:sz w:val="20"/>
+          <w:szCs w:val="20"/>
+        </w:rPr>
+        <w:t>.</w:t>
       </w:r>
     </w:p>
     <w:p>
       <w:pPr>
+        <w:rPr>
+          <w:rFonts w:ascii="Open Sans Light" w:eastAsia="Open Sans Light" w:hAnsi="Open Sans Light" w:cs="Open Sans Light"/>
+          <w:sz w:val="20"/>
+          <w:szCs w:val="20"/>
+        </w:rPr>
+      </w:pPr>
+      <w:proofErr w:type="spellStart"/>
+      <w:r>
+        <w:rPr>
+          <w:rFonts w:ascii="Open Sans Light" w:eastAsia="Open Sans Light" w:hAnsi="Open Sans Light" w:cs="Open Sans Light"/>
+          <w:sz w:val="20"/>
+          <w:szCs w:val="20"/>
+        </w:rPr>
+        <w:t>Aquest</w:t>
+      </w:r>
+      <w:proofErr w:type="spellEnd"/>
+      <w:r>
+        <w:rPr>
+          <w:rFonts w:ascii="Open Sans Light" w:eastAsia="Open Sans Light" w:hAnsi="Open Sans Light" w:cs="Open Sans Light"/>
+          <w:sz w:val="20"/>
+          <w:szCs w:val="20"/>
+        </w:rPr>
+        <w:t xml:space="preserve"> tercer ha </w:t>
+      </w:r>
+      <w:proofErr w:type="spellStart"/>
+      <w:r>
+        <w:rPr>
+          <w:rFonts w:ascii="Open Sans Light" w:eastAsia="Open Sans Light" w:hAnsi="Open Sans Light" w:cs="Open Sans Light"/>
+          <w:sz w:val="20"/>
+          <w:szCs w:val="20"/>
+        </w:rPr>
+        <w:t>estat</w:t>
+      </w:r>
+      <w:proofErr w:type="spellEnd"/>
+      <w:r>
+        <w:rPr>
+          <w:rFonts w:ascii="Open Sans Light" w:eastAsia="Open Sans Light" w:hAnsi="Open Sans Light" w:cs="Open Sans Light"/>
+          <w:sz w:val="20"/>
+          <w:szCs w:val="20"/>
+        </w:rPr>
+        <w:t xml:space="preserve"> </w:t>
+      </w:r>
+      <w:proofErr w:type="spellStart"/>
+      <w:r>
+        <w:rPr>
+          <w:rFonts w:ascii="Open Sans Light" w:eastAsia="Open Sans Light" w:hAnsi="Open Sans Light" w:cs="Open Sans Light"/>
+          <w:sz w:val="20"/>
+          <w:szCs w:val="20"/>
+        </w:rPr>
+        <w:t>seleccionat</w:t>
+      </w:r>
+      <w:proofErr w:type="spellEnd"/>
+      <w:r>
+        <w:rPr>
+          <w:rFonts w:ascii="Open Sans Light" w:eastAsia="Open Sans Light" w:hAnsi="Open Sans Light" w:cs="Open Sans Light"/>
+          <w:sz w:val="20"/>
+          <w:szCs w:val="20"/>
+        </w:rPr>
+        <w:t xml:space="preserve"> </w:t>
+      </w:r>
+      <w:proofErr w:type="spellStart"/>
+      <w:r>
+        <w:rPr>
+          <w:rFonts w:ascii="Open Sans Light" w:eastAsia="Open Sans Light" w:hAnsi="Open Sans Light" w:cs="Open Sans Light"/>
+          <w:sz w:val="20"/>
+          <w:szCs w:val="20"/>
+        </w:rPr>
+        <w:t>baix</w:t>
+      </w:r>
+      <w:proofErr w:type="spellEnd"/>
+      <w:r>
+        <w:rPr>
+          <w:rFonts w:ascii="Open Sans Light" w:eastAsia="Open Sans Light" w:hAnsi="Open Sans Light" w:cs="Open Sans Light"/>
+          <w:sz w:val="20"/>
+          <w:szCs w:val="20"/>
+        </w:rPr>
+        <w:t xml:space="preserve"> el </w:t>
+      </w:r>
+      <w:proofErr w:type="spellStart"/>
+      <w:r>
+        <w:rPr>
+          <w:rFonts w:ascii="Open Sans Light" w:eastAsia="Open Sans Light" w:hAnsi="Open Sans Light" w:cs="Open Sans Light"/>
+          <w:sz w:val="20"/>
+          <w:szCs w:val="20"/>
+        </w:rPr>
+        <w:t>criteri</w:t>
+      </w:r>
+      <w:proofErr w:type="spellEnd"/>
+      <w:r>
+        <w:rPr>
+          <w:rFonts w:ascii="Open Sans Light" w:eastAsia="Open Sans Light" w:hAnsi="Open Sans Light" w:cs="Open Sans Light"/>
+          <w:sz w:val="20"/>
+          <w:szCs w:val="20"/>
+        </w:rPr>
+        <w:t xml:space="preserve"> de </w:t>
+      </w:r>
+      <w:r>
+        <w:rPr>
+          <w:rFonts w:ascii="Open Sans Light" w:eastAsia="Open Sans Light" w:hAnsi="Open Sans Light" w:cs="Open Sans Light"/>
+          <w:sz w:val="20"/>
+          <w:szCs w:val="20"/>
+        </w:rPr>
+        <w:t>{{</w:t>
+      </w:r>
+      <w:bookmarkStart w:id="0" w:name="_GoBack"/>
+      <w:bookmarkEnd w:id="0"/>
+      <w:proofErr w:type="spellStart"/>
+      <w:proofErr w:type="gramStart"/>
+      <w:r>
+        <w:rPr>
+          <w:rFonts w:ascii="Open Sans Light" w:eastAsia="Open Sans Light" w:hAnsi="Open Sans Light" w:cs="Open Sans Light"/>
+          <w:sz w:val="20"/>
+          <w:szCs w:val="20"/>
+        </w:rPr>
+        <w:t>record.</w:t>
+      </w:r>
+      <w:r>
+        <w:rPr>
+          <w:rFonts w:ascii="Open Sans Light" w:eastAsia="Open Sans Light" w:hAnsi="Open Sans Light" w:cs="Open Sans Light"/>
+          <w:sz w:val="20"/>
+          <w:szCs w:val="20"/>
+        </w:rPr>
+        <w:t>motivacio</w:t>
+      </w:r>
+      <w:proofErr w:type="gramEnd"/>
+      <w:r>
+        <w:rPr>
+          <w:rFonts w:ascii="Open Sans Light" w:eastAsia="Open Sans Light" w:hAnsi="Open Sans Light" w:cs="Open Sans Light"/>
+          <w:sz w:val="20"/>
+          <w:szCs w:val="20"/>
+        </w:rPr>
+        <w:t>_seleccio</w:t>
+      </w:r>
+      <w:proofErr w:type="spellEnd"/>
+      <w:r>
+        <w:rPr>
+          <w:rFonts w:ascii="Open Sans Light" w:eastAsia="Open Sans Light" w:hAnsi="Open Sans Light" w:cs="Open Sans Light"/>
+          <w:sz w:val="20"/>
+          <w:szCs w:val="20"/>
+        </w:rPr>
+        <w:t>}}</w:t>
+      </w:r>
+    </w:p>
+    <w:p>
+      <w:pPr>
         <w:spacing w:before="100" w:beforeAutospacing="1" w:after="100" w:afterAutospacing="1" w:line="240" w:lineRule="auto"/>
         <w:outlineLvl w:val="1"/>
         <w:rPr>
@@ -2106,16 +2235,7 @@
           <w:sz w:val="20"/>
           <w:szCs w:val="20"/>
         </w:rPr>
-        <w:t>explicacio</w:t>
-      </w:r>
-      <w:r>
-        <w:rPr>
-          <w:rFonts w:ascii="Open Sans Light" w:eastAsia="Open Sans Light" w:hAnsi="Open Sans Light" w:cs="Open Sans Light"/>
-          <w:noProof/>
-          <w:sz w:val="20"/>
-          <w:szCs w:val="20"/>
-        </w:rPr>
-        <w:t>_no_contractacio</w:t>
+        <w:t>explicacio_no_contractacio</w:t>
       </w:r>
       <w:r>
         <w:rPr>
@@ -2637,16 +2757,7 @@
           <w:sz w:val="20"/>
           <w:szCs w:val="20"/>
         </w:rPr>
-        <w:t>explicacio</w:t>
-      </w:r>
-      <w:r>
-        <w:rPr>
-          <w:rFonts w:ascii="Open Sans Light" w:eastAsia="Open Sans Light" w:hAnsi="Open Sans Light" w:cs="Open Sans Light"/>
-          <w:noProof/>
-          <w:sz w:val="20"/>
-          <w:szCs w:val="20"/>
-        </w:rPr>
-        <w:t>_preu</w:t>
+        <w:t>explicacio_preu</w:t>
       </w:r>
       <w:r>
         <w:rPr>
@@ -4042,17 +4153,6 @@
 </file>
 
 <file path=customXml/item1.xml><?xml version="1.0" encoding="utf-8"?>
-<p:properties xmlns:p="http://schemas.microsoft.com/office/2006/metadata/properties" xmlns:xsi="http://www.w3.org/2001/XMLSchema-instance" xmlns:pc="http://schemas.microsoft.com/office/infopath/2007/PartnerControls">
-  <documentManagement>
-    <TaxCatchAll xmlns="108d9c73-5d46-4471-9bd8-029f5de3680f" xsi:nil="true"/>
-    <lcf76f155ced4ddcb4097134ff3c332f xmlns="74cf42d7-5302-4f1c-a14a-4e00bba5b2a8">
-      <Terms xmlns="http://schemas.microsoft.com/office/infopath/2007/PartnerControls"/>
-    </lcf76f155ced4ddcb4097134ff3c332f>
-  </documentManagement>
-</p:properties>
-</file>
-
-<file path=customXml/item2.xml><?xml version="1.0" encoding="utf-8"?>
 <ct:contentTypeSchema xmlns:ct="http://schemas.microsoft.com/office/2006/metadata/contentType" xmlns:ma="http://schemas.microsoft.com/office/2006/metadata/properties/metaAttributes" ct:_="" ma:_="" ma:contentTypeName="Documento" ma:contentTypeID="0x010100BEA9B1C7EBF6D3438CD7ED5E9E199432" ma:contentTypeVersion="14" ma:contentTypeDescription="Crear nuevo documento." ma:contentTypeScope="" ma:versionID="2e283e6bc3a5fbbefccc32c5f809dde4">
   <xsd:schema xmlns:xsd="http://www.w3.org/2001/XMLSchema" xmlns:xs="http://www.w3.org/2001/XMLSchema" xmlns:p="http://schemas.microsoft.com/office/2006/metadata/properties" xmlns:ns2="74cf42d7-5302-4f1c-a14a-4e00bba5b2a8" xmlns:ns3="108d9c73-5d46-4471-9bd8-029f5de3680f" targetNamespace="http://schemas.microsoft.com/office/2006/metadata/properties" ma:root="true" ma:fieldsID="670afdc93dcbe6e64409644886b33f83" ns2:_="" ns3:_="">
     <xsd:import namespace="74cf42d7-5302-4f1c-a14a-4e00bba5b2a8"/>
@@ -4281,6 +4381,17 @@
 </ct:contentTypeSchema>
 </file>
 
+<file path=customXml/item2.xml><?xml version="1.0" encoding="utf-8"?>
+<p:properties xmlns:p="http://schemas.microsoft.com/office/2006/metadata/properties" xmlns:xsi="http://www.w3.org/2001/XMLSchema-instance" xmlns:pc="http://schemas.microsoft.com/office/infopath/2007/PartnerControls">
+  <documentManagement>
+    <TaxCatchAll xmlns="108d9c73-5d46-4471-9bd8-029f5de3680f" xsi:nil="true"/>
+    <lcf76f155ced4ddcb4097134ff3c332f xmlns="74cf42d7-5302-4f1c-a14a-4e00bba5b2a8">
+      <Terms xmlns="http://schemas.microsoft.com/office/infopath/2007/PartnerControls"/>
+    </lcf76f155ced4ddcb4097134ff3c332f>
+  </documentManagement>
+</p:properties>
+</file>
+
 <file path=customXml/item3.xml><?xml version="1.0" encoding="utf-8"?>
 <?mso-contentType ?>
 <FormTemplates xmlns="http://schemas.microsoft.com/sharepoint/v3/contenttype/forms">
@@ -4295,17 +4406,6 @@
 </file>
 
 <file path=customXml/itemProps1.xml><?xml version="1.0" encoding="utf-8"?>
-<ds:datastoreItem xmlns:ds="http://schemas.openxmlformats.org/officeDocument/2006/customXml" ds:itemID="{EF14DB54-CEC9-47B5-A13D-53C8A329E037}">
-  <ds:schemaRefs>
-    <ds:schemaRef ds:uri="http://schemas.microsoft.com/office/2006/metadata/properties"/>
-    <ds:schemaRef ds:uri="http://schemas.microsoft.com/office/infopath/2007/PartnerControls"/>
-    <ds:schemaRef ds:uri="108d9c73-5d46-4471-9bd8-029f5de3680f"/>
-    <ds:schemaRef ds:uri="74cf42d7-5302-4f1c-a14a-4e00bba5b2a8"/>
-  </ds:schemaRefs>
-</ds:datastoreItem>
-</file>
-
-<file path=customXml/itemProps2.xml><?xml version="1.0" encoding="utf-8"?>
 <ds:datastoreItem xmlns:ds="http://schemas.openxmlformats.org/officeDocument/2006/customXml" ds:itemID="{02882DF2-B128-4C90-8FFD-571E4B92AFFE}">
   <ds:schemaRefs>
     <ds:schemaRef ds:uri="http://schemas.microsoft.com/office/2006/metadata/contentType"/>
@@ -4324,6 +4424,17 @@
 </ds:datastoreItem>
 </file>
 
+<file path=customXml/itemProps2.xml><?xml version="1.0" encoding="utf-8"?>
+<ds:datastoreItem xmlns:ds="http://schemas.openxmlformats.org/officeDocument/2006/customXml" ds:itemID="{EF14DB54-CEC9-47B5-A13D-53C8A329E037}">
+  <ds:schemaRefs>
+    <ds:schemaRef ds:uri="http://schemas.microsoft.com/office/2006/metadata/properties"/>
+    <ds:schemaRef ds:uri="http://schemas.microsoft.com/office/infopath/2007/PartnerControls"/>
+    <ds:schemaRef ds:uri="108d9c73-5d46-4471-9bd8-029f5de3680f"/>
+    <ds:schemaRef ds:uri="74cf42d7-5302-4f1c-a14a-4e00bba5b2a8"/>
+  </ds:schemaRefs>
+</ds:datastoreItem>
+</file>
+
 <file path=customXml/itemProps3.xml><?xml version="1.0" encoding="utf-8"?>
 <ds:datastoreItem xmlns:ds="http://schemas.openxmlformats.org/officeDocument/2006/customXml" ds:itemID="{150801C8-2C01-424E-BC6C-56C9B08C462E}">
   <ds:schemaRefs>
@@ -4333,7 +4444,7 @@
 </file>
 
 <file path=customXml/itemProps4.xml><?xml version="1.0" encoding="utf-8"?>
-<ds:datastoreItem xmlns:ds="http://schemas.openxmlformats.org/officeDocument/2006/customXml" ds:itemID="{7F102218-426B-4983-8477-E5076A01DD42}">
+<ds:datastoreItem xmlns:ds="http://schemas.openxmlformats.org/officeDocument/2006/customXml" ds:itemID="{BDF5D54B-53B0-4C6A-A229-338C1DC0DEF9}">
   <ds:schemaRefs>
     <ds:schemaRef ds:uri="http://schemas.openxmlformats.org/officeDocument/2006/bibliography"/>
   </ds:schemaRefs>

</xml_diff>